<commit_message>
File added 1.docx with a description of the actions
</commit_message>
<xml_diff>
--- a/1.docx
+++ b/1.docx
@@ -42,15 +42,7 @@
           <w:color w:val="0F1115"/>
           <w:shd w:val="clear" w:color="auto" w:fill="FFFFFF"/>
         </w:rPr>
-        <w:t>Создания ветки</w:t>
-      </w:r>
-      <w:r>
-        <w:rPr>
-          <w:rFonts w:ascii="Segoe UI" w:hAnsi="Segoe UI" w:cs="Segoe UI"/>
-          <w:color w:val="0F1115"/>
-          <w:shd w:val="clear" w:color="auto" w:fill="FFFFFF"/>
-        </w:rPr>
-        <w:t>:</w:t>
+        <w:t>Создания ветки:</w:t>
       </w:r>
     </w:p>
     <w:p>
@@ -121,15 +113,7 @@
           <w:color w:val="0F1115"/>
           <w:shd w:val="clear" w:color="auto" w:fill="FFFFFF"/>
         </w:rPr>
-        <w:t>Изменения кода</w:t>
-      </w:r>
-      <w:r>
-        <w:rPr>
-          <w:rFonts w:ascii="Segoe UI" w:hAnsi="Segoe UI" w:cs="Segoe UI"/>
-          <w:color w:val="0F1115"/>
-          <w:shd w:val="clear" w:color="auto" w:fill="FFFFFF"/>
-        </w:rPr>
-        <w:t>:</w:t>
+        <w:t>Изменения кода:</w:t>
       </w:r>
     </w:p>
     <w:p>
@@ -287,7 +271,9 @@
     <w:p>
       <w:pPr>
         <w:rPr>
-          <w:u w:val="single"/>
+          <w:rFonts w:ascii="Segoe UI" w:hAnsi="Segoe UI" w:cs="Segoe UI"/>
+          <w:color w:val="0F1115"/>
+          <w:shd w:val="clear" w:color="auto" w:fill="FFFFFF"/>
         </w:rPr>
       </w:pPr>
       <w:r>
@@ -297,17 +283,7 @@
           <w:shd w:val="clear" w:color="auto" w:fill="FFFFFF"/>
         </w:rPr>
         <w:lastRenderedPageBreak/>
-        <w:t>Отп</w:t>
-      </w:r>
-      <w:bookmarkStart w:id="0" w:name="_GoBack"/>
-      <w:bookmarkEnd w:id="0"/>
-      <w:r>
-        <w:rPr>
-          <w:rFonts w:ascii="Segoe UI" w:hAnsi="Segoe UI" w:cs="Segoe UI"/>
-          <w:color w:val="0F1115"/>
-          <w:shd w:val="clear" w:color="auto" w:fill="FFFFFF"/>
-        </w:rPr>
-        <w:t xml:space="preserve">равки на </w:t>
+        <w:t xml:space="preserve">Отправки на </w:t>
       </w:r>
       <w:proofErr w:type="spellStart"/>
       <w:r>
@@ -327,6 +303,55 @@
         </w:rPr>
         <w:t>:</w:t>
       </w:r>
+    </w:p>
+    <w:p>
+      <w:pPr>
+        <w:rPr>
+          <w:u w:val="single"/>
+        </w:rPr>
+      </w:pPr>
+      <w:r>
+        <w:rPr>
+          <w:u w:val="single"/>
+        </w:rPr>
+        <w:drawing>
+          <wp:inline distT="0" distB="0" distL="0" distR="0" wp14:anchorId="3A630544" wp14:editId="03CDC332">
+            <wp:extent cx="5563376" cy="1247949"/>
+            <wp:effectExtent l="0" t="0" r="0" b="9525"/>
+            <wp:docPr id="4" name="Рисунок 4"/>
+            <wp:cNvGraphicFramePr>
+              <a:graphicFrameLocks xmlns:a="http://schemas.openxmlformats.org/drawingml/2006/main" noChangeAspect="1"/>
+            </wp:cNvGraphicFramePr>
+            <a:graphic xmlns:a="http://schemas.openxmlformats.org/drawingml/2006/main">
+              <a:graphicData uri="http://schemas.openxmlformats.org/drawingml/2006/picture">
+                <pic:pic xmlns:pic="http://schemas.openxmlformats.org/drawingml/2006/picture">
+                  <pic:nvPicPr>
+                    <pic:cNvPr id="1" name=""/>
+                    <pic:cNvPicPr/>
+                  </pic:nvPicPr>
+                  <pic:blipFill>
+                    <a:blip r:embed="rId8"/>
+                    <a:stretch>
+                      <a:fillRect/>
+                    </a:stretch>
+                  </pic:blipFill>
+                  <pic:spPr>
+                    <a:xfrm>
+                      <a:off x="0" y="0"/>
+                      <a:ext cx="5563376" cy="1247949"/>
+                    </a:xfrm>
+                    <a:prstGeom prst="rect">
+                      <a:avLst/>
+                    </a:prstGeom>
+                  </pic:spPr>
+                </pic:pic>
+              </a:graphicData>
+            </a:graphic>
+          </wp:inline>
+        </w:drawing>
+      </w:r>
+      <w:bookmarkStart w:id="0" w:name="_GoBack"/>
+      <w:bookmarkEnd w:id="0"/>
     </w:p>
     <w:sectPr>
       <w:pgSz w:w="11906" w:h="16838"/>

</xml_diff>